<commit_message>
Pulir reporte de Activity 3 tras verificación con agentes
Redacción: term "overrides", "instantiated", corrección de la
descripción del encadenamiento de constructores y ajustes de claridad.
El listado de código del reporte ahora es copia verbatim de los .java
(Javadoc completo), idéntico a los archivos entregados. Código y salida
sin cambios (verificados: compila con -Werror, salida byte por byte).

Co-Authored-By: Claude Opus 4.8 <noreply@anthropic.com>
Claude-Session: https://claude.ai/code/session_01V8FTv6GL1GGnkPBui9rwPG
</commit_message>
<xml_diff>
--- a/activity3-hospital-report.docx
+++ b/activity3-hospital-report.docx
@@ -253,7 +253,7 @@
           <w:szCs w:val="22"/>
           <w:rFonts w:ascii="Arial" w:cs="Arial" w:eastAsia="Arial" w:hAnsi="Arial"/>
         </w:rPr>
-        <w:t xml:space="preserve">This activity models the people of a regional hospital with an object-oriented class hierarchy. The design rests on the three ideas the activity asks for: inheritance, abstraction and overloading. There are five files: the abstract class Person, its three subclasses Doctor, Patient and Guard, and a test program that creates one of each and registers them.</w:t>
+        <w:t xml:space="preserve">This activity models the different people found in a regional hospital with an object-oriented class hierarchy. The design rests on the three ideas the activity asks for: inheritance, abstraction and overloading. There are five files: the abstract class Person, its three subclasses Doctor, Patient and Guard, and a test program that creates a doctor, a patient and two guards, then registers each one.</w:t>
       </w:r>
     </w:p>
     <w:p>
@@ -267,7 +267,7 @@
           <w:szCs w:val="22"/>
           <w:rFonts w:ascii="Arial" w:cs="Arial" w:eastAsia="Arial" w:hAnsi="Arial"/>
         </w:rPr>
-        <w:t xml:space="preserve">Person is an abstract superclass. It stores the two data fields every person shares, name and age, and exposes them through getName and getAge. It also declares an abstract method, register, with no body. Because the class is abstract it cannot be created on its own; it only serves as the common base for the specific people. That is abstraction: the shared idea of a person lives in one place and each subclass fills in the rest.</w:t>
+        <w:t xml:space="preserve">Person is an abstract superclass. It stores the two data fields every person shares, name and age, and exposes them through getName and getAge. It also declares an abstract method, register, with no body. Because the class is abstract it cannot be instantiated on its own; it only serves as the common base for the specific people. That is abstraction: the shared idea of a person lives in one place and each subclass fills in the rest.</w:t>
       </w:r>
     </w:p>
     <w:p>
@@ -281,7 +281,7 @@
           <w:szCs w:val="22"/>
           <w:rFonts w:ascii="Arial" w:cs="Arial" w:eastAsia="Arial" w:hAnsi="Arial"/>
         </w:rPr>
-        <w:t xml:space="preserve">Doctor, Patient and Guard extend Person, so they inherit name, age and their getters. Each subclass adds only what makes it different: Doctor adds a department, Patient adds an illness, and Guard adds a shift and an optional phone. Every subclass constructor calls super(name, age), so the shared data is set by the Person constructor instead of being repeated in each class.</w:t>
+        <w:t xml:space="preserve">Doctor, Patient and Guard extend Person, so they inherit name, age and their getters. Each subclass adds only what makes it different: Doctor adds a department, Patient adds an illness, and Guard adds a shift and an optional phone. Each subclass reuses the Person constructor through super(name, age), and the Guard's short constructor reaches it by chaining, so the shared data is set in one place instead of being repeated in each class.</w:t>
       </w:r>
     </w:p>
     <w:p>
@@ -295,7 +295,7 @@
           <w:szCs w:val="22"/>
           <w:rFonts w:ascii="Arial" w:cs="Arial" w:eastAsia="Arial" w:hAnsi="Arial"/>
         </w:rPr>
-        <w:t xml:space="preserve">Each subclass writes its own register method. When register is called, Java runs the version that belongs to the real object, so a Doctor prints “Welcome Doctor!”, a Patient prints “Welcome Patient!” and a Guard prints “Welcome Guard!”. This is the idea from the learning goal, different people performing the same activity in their own way, and in Java it is called polymorphism.</w:t>
+        <w:t xml:space="preserve">Each subclass overrides register with its own version. When register is called, Java runs the version that belongs to the real object, so a Doctor prints “Welcome Doctor!”, a Patient prints “Welcome Patient!” and a Guard prints “Welcome Guard!”. This matches the learning goal: different people performing the same action in their own way, which in Java is called polymorphism.</w:t>
       </w:r>
     </w:p>
     <w:p>
@@ -309,7 +309,7 @@
           <w:szCs w:val="22"/>
           <w:rFonts w:ascii="Arial" w:cs="Arial" w:eastAsia="Arial" w:hAnsi="Arial"/>
         </w:rPr>
-        <w:t xml:space="preserve">Guard shows overloading with two constructors: one receives a phone number and the other does not. The shorter constructor calls the longer one with this(name, age, shift, null), so the setup code is written a single time and a guard can be created either way. The test uses John, created without a phone, and Kevin, created with one, to exercise both constructors.</w:t>
+        <w:t xml:space="preserve">Guard shows overloading with two constructors: one receives a phone number and the other does not. The shorter constructor calls the longer one with this(name, age, shift, null), so the setup code is written only once and a guard can be created either way. The test uses John, created without a phone, and Kevin, created with one, to exercise both constructors.</w:t>
       </w:r>
     </w:p>
     <w:p>
@@ -3116,7 +3116,7 @@
           <w:szCs w:val="22"/>
           <w:rFonts w:ascii="Arial" w:cs="Arial" w:eastAsia="Arial" w:hAnsi="Arial"/>
         </w:rPr>
-        <w:t xml:space="preserve">The five files compile with javac without errors or warnings, and the test program prints the data of the four people together with the welcome message produced by each register method. John, built with the three-argument constructor, shows “not provided” as phone, while Kevin, built with the four-argument constructor, shows his number. The screenshot shows the compilation and the run:</w:t>
+        <w:t xml:space="preserve">The five files compile with javac without errors or warnings, and the test program prints the data of the four people together with the welcome message produced by each register method. John, built with the three-argument constructor, shows “not provided” for the phone, while Kevin, built with the four-argument constructor, displays his number. The terminal output below shows the compilation and the run:</w:t>
       </w:r>
     </w:p>
     <w:p>

</xml_diff>